<commit_message>
Update ETL Doc Template: fix alignment, add What is ETL and real estate model sections
- Fixed alignment of existing content (date block right-aligned, headings, spacing)
- Added 'WHAT IS ETL?' section (Eat Truck Love, subsidiary of Azimuth Business on Wheels, food zones concept, live zones at Alpha 1 / Central 50 / Bennett University)
- Added 'MODELS ON WHICH ETL OPERATES' section with Real Estate model
- Preserved header ETL logo, footer Azimuth branding, divider line and hyperlinks
</commit_message>
<xml_diff>
--- a/ETL Doc Template.docx
+++ b/ETL Doc Template.docx
@@ -133,6 +133,119 @@
     </w:p>
     <w:p>
       <w:pPr>
+        <w:spacing w:before="280" w:after="80" w:line="240" w:lineRule="auto"/>
+        <w:jc w:val="left"/>
+      </w:pPr>
+      <w:r>
+        <w:rPr>
+          <w:rFonts w:ascii="Arial" w:hAnsi="Arial" w:cs="Arial" w:eastAsia="Arial"/>
+          <w:b/>
+          <w:i w:val="0"/>
+          <w:color w:val="000000"/>
+          <w:sz w:val="28"/>
+        </w:rPr>
+        <w:t>WHAT IS ETL?</w:t>
+      </w:r>
+    </w:p>
+    <w:p>
+      <w:pPr>
+        <w:spacing w:before="0" w:after="120" w:line="276" w:lineRule="auto"/>
+        <w:jc w:val="both"/>
+      </w:pPr>
+      <w:r>
+        <w:rPr>
+          <w:rFonts w:ascii="Arial" w:hAnsi="Arial" w:cs="Arial" w:eastAsia="Arial"/>
+          <w:b w:val="0"/>
+          <w:i w:val="0"/>
+          <w:color w:val="000000"/>
+          <w:sz w:val="22"/>
+        </w:rPr>
+        <w:t>ETL (Eat Truck Love) is a curated outdoor food destination brand and a subsidiary of Azimuth Business on Wheels – India’s leading mobile infrastructure company. Azimuth designs and manufactures food kiosks, trucks and trailers for its customers; through ETL we take this a step further by creating dedicated, ready-to-operate food zones where these units come together as a single, well-managed food &amp; beverage destination. This gives both first-time entrepreneurs and established brands a legitimate, fully-serviced location to operate from – without the cost and rigidity of permanent construction.</w:t>
+      </w:r>
+    </w:p>
+    <w:p>
+      <w:pPr>
+        <w:spacing w:before="0" w:after="120" w:line="276" w:lineRule="auto"/>
+        <w:jc w:val="both"/>
+      </w:pPr>
+      <w:r>
+        <w:rPr>
+          <w:rFonts w:ascii="Arial" w:hAnsi="Arial" w:cs="Arial" w:eastAsia="Arial"/>
+          <w:b w:val="0"/>
+          <w:i w:val="0"/>
+          <w:color w:val="000000"/>
+          <w:sz w:val="22"/>
+        </w:rPr>
+        <w:t>ETL currently operates live food zones at Alpha 1, Central 50 and Bennett University, with plans to expand to more locations.</w:t>
+      </w:r>
+    </w:p>
+    <w:p>
+      <w:pPr>
+        <w:spacing w:before="280" w:after="80" w:line="240" w:lineRule="auto"/>
+        <w:jc w:val="left"/>
+      </w:pPr>
+      <w:r>
+        <w:rPr>
+          <w:rFonts w:ascii="Arial" w:hAnsi="Arial" w:cs="Arial" w:eastAsia="Arial"/>
+          <w:b/>
+          <w:i w:val="0"/>
+          <w:color w:val="000000"/>
+          <w:sz w:val="28"/>
+        </w:rPr>
+        <w:t>MODELS ON WHICH ETL OPERATES</w:t>
+      </w:r>
+    </w:p>
+    <w:p>
+      <w:pPr>
+        <w:spacing w:before="0" w:after="120" w:line="276" w:lineRule="auto"/>
+        <w:jc w:val="both"/>
+      </w:pPr>
+      <w:r>
+        <w:rPr>
+          <w:rFonts w:ascii="Arial" w:hAnsi="Arial" w:cs="Arial" w:eastAsia="Arial"/>
+          <w:b w:val="0"/>
+          <w:i w:val="0"/>
+          <w:color w:val="000000"/>
+          <w:sz w:val="22"/>
+        </w:rPr>
+        <w:t>ETL operates on a real estate model. Instead of building a conventional food court or permitting unstructured vending, ETL converts underutilised or unused outdoor land into a curated, revenue-generating food &amp; beverage zone using mobile food units.</w:t>
+      </w:r>
+    </w:p>
+    <w:p>
+      <w:pPr>
+        <w:spacing w:before="0" w:after="80" w:line="276" w:lineRule="auto"/>
+        <w:ind w:left="360"/>
+        <w:jc w:val="both"/>
+      </w:pPr>
+      <w:r>
+        <w:rPr>
+          <w:rFonts w:ascii="Arial" w:hAnsi="Arial" w:cs="Arial" w:eastAsia="Arial"/>
+          <w:b/>
+          <w:i w:val="0"/>
+          <w:color w:val="000000"/>
+          <w:sz w:val="22"/>
+        </w:rPr>
+        <w:t xml:space="preserve">•  Real Estate: </w:t>
+      </w:r>
+      <w:r>
+        <w:rPr>
+          <w:rFonts w:ascii="Arial" w:hAnsi="Arial" w:cs="Arial" w:eastAsia="Arial"/>
+          <w:b w:val="0"/>
+          <w:i w:val="0"/>
+          <w:color w:val="000000"/>
+          <w:sz w:val="22"/>
+        </w:rPr>
+        <w:t>For property owners – universities, townships, metro-adjacent developments and malls – an ETL zone is a faster and more flexible alternative to permanent construction, offering greater control over the brand mix and the overall customer experience. Because the units are manufactured in-house with utilities, ventilation and hygiene built in at the fabrication stage, a zone can be deployed quickly and scaled or relocated as required.</w:t>
+      </w:r>
+    </w:p>
+    <w:p>
+      <w:pPr>
+        <w:spacing w:after="40"/>
+      </w:pPr>
+    </w:p>
+    <w:p>
+      <w:pPr>
+        <w:spacing w:before="280" w:after="40"/>
         <w:rPr>
           <w:rFonts w:ascii="Arial" w:cs="Arial" w:eastAsia="Arial" w:hAnsi="Arial"/>
           <w:b w:val="1"/>
@@ -153,102 +266,6 @@
           <w:rtl w:val="0"/>
         </w:rPr>
         <w:t xml:space="preserve">PROPOSED BRAND LIST : </w:t>
-      </w:r>
-    </w:p>
-    <w:p>
-      <w:pPr>
-        <w:pageBreakBefore w:val="0"/>
-        <w:pBdr>
-          <w:top w:space="0" w:sz="0" w:val="nil"/>
-          <w:left w:space="0" w:sz="0" w:val="nil"/>
-          <w:bottom w:space="0" w:sz="0" w:val="nil"/>
-          <w:right w:space="0" w:sz="0" w:val="nil"/>
-          <w:between w:space="0" w:sz="0" w:val="nil"/>
-        </w:pBdr>
-        <w:shd w:fill="auto" w:val="clear"/>
-        <w:spacing w:before="400" w:line="360" w:lineRule="auto"/>
-        <w:ind w:left="-15" w:firstLine="0"/>
-        <w:rPr>
-          <w:rFonts w:ascii="Arial" w:cs="Arial" w:eastAsia="Arial" w:hAnsi="Arial"/>
-          <w:color w:val="000000"/>
-        </w:rPr>
-      </w:pPr>
-      <w:r>
-        <w:rPr>
-          <w:rtl w:val="0"/>
-        </w:rPr>
-      </w:r>
-    </w:p>
-    <w:p>
-      <w:pPr>
-        <w:pageBreakBefore w:val="0"/>
-        <w:pBdr>
-          <w:top w:space="0" w:sz="0" w:val="nil"/>
-          <w:left w:space="0" w:sz="0" w:val="nil"/>
-          <w:bottom w:space="0" w:sz="0" w:val="nil"/>
-          <w:right w:space="0" w:sz="0" w:val="nil"/>
-          <w:between w:space="0" w:sz="0" w:val="nil"/>
-        </w:pBdr>
-        <w:shd w:fill="auto" w:val="clear"/>
-        <w:spacing w:before="400" w:line="360" w:lineRule="auto"/>
-        <w:ind w:left="-15" w:firstLine="0"/>
-        <w:rPr>
-          <w:rFonts w:ascii="Arial" w:cs="Arial" w:eastAsia="Arial" w:hAnsi="Arial"/>
-          <w:color w:val="000000"/>
-        </w:rPr>
-      </w:pPr>
-      <w:r>
-        <w:rPr>
-          <w:rtl w:val="0"/>
-        </w:rPr>
-      </w:r>
-    </w:p>
-    <w:p>
-      <w:pPr>
-        <w:pageBreakBefore w:val="0"/>
-        <w:pBdr>
-          <w:top w:space="0" w:sz="0" w:val="nil"/>
-          <w:left w:space="0" w:sz="0" w:val="nil"/>
-          <w:bottom w:space="0" w:sz="0" w:val="nil"/>
-          <w:right w:space="0" w:sz="0" w:val="nil"/>
-          <w:between w:space="0" w:sz="0" w:val="nil"/>
-        </w:pBdr>
-        <w:shd w:fill="auto" w:val="clear"/>
-        <w:spacing w:before="400" w:line="360" w:lineRule="auto"/>
-        <w:ind w:left="-15" w:firstLine="0"/>
-        <w:rPr>
-          <w:rFonts w:ascii="Arial" w:cs="Arial" w:eastAsia="Arial" w:hAnsi="Arial"/>
-          <w:color w:val="000000"/>
-        </w:rPr>
-      </w:pPr>
-      <w:r>
-        <w:rPr>
-          <w:rtl w:val="0"/>
-        </w:rPr>
-      </w:r>
-    </w:p>
-    <w:p>
-      <w:pPr>
-        <w:pageBreakBefore w:val="0"/>
-        <w:pBdr>
-          <w:top w:space="0" w:sz="0" w:val="nil"/>
-          <w:left w:space="0" w:sz="0" w:val="nil"/>
-          <w:bottom w:space="0" w:sz="0" w:val="nil"/>
-          <w:right w:space="0" w:sz="0" w:val="nil"/>
-          <w:between w:space="0" w:sz="0" w:val="nil"/>
-        </w:pBdr>
-        <w:shd w:fill="auto" w:val="clear"/>
-        <w:spacing w:before="400" w:line="360" w:lineRule="auto"/>
-        <w:ind w:left="-15" w:firstLine="0"/>
-        <w:rPr>
-          <w:rFonts w:ascii="Arial" w:cs="Arial" w:eastAsia="Arial" w:hAnsi="Arial"/>
-          <w:color w:val="000000"/>
-        </w:rPr>
-      </w:pPr>
-      <w:r>
-        <w:rPr>
-          <w:rtl w:val="0"/>
-        </w:rPr>
       </w:r>
     </w:p>
     <w:p>

</xml_diff>

<commit_message>
Refine ETL 1-page doc: drop What is ETL, number the points, add (Eat Truck Love) to headings
- Removed the WHAT IS ETL section
- Added 1/2/3 numbering to the Models and Variable Factors points
- Headings now read 'ETL (EAT TRUCK LOVE)'
- Kept single-page layout with header/footer branding intact
</commit_message>
<xml_diff>
--- a/ETL Doc Template.docx
+++ b/ETL Doc Template.docx
@@ -13,14 +13,14 @@
           <w:b w:val="0"/>
           <w:i w:val="0"/>
           <w:color w:val="000000"/>
-          <w:sz w:val="21"/>
+          <w:sz w:val="22"/>
         </w:rPr>
         <w:t>DATE: 21st August 2026</w:t>
       </w:r>
     </w:p>
     <w:p>
       <w:pPr>
-        <w:spacing w:after="120" w:line="240" w:lineRule="auto"/>
+        <w:spacing w:after="160" w:line="240" w:lineRule="auto"/>
         <w:jc w:val="right"/>
         <w:pBdr>
           <w:bottom w:val="single" w:sz="6" w:space="6" w:color="B0B0B0"/>
@@ -32,7 +32,7 @@
           <w:b w:val="0"/>
           <w:i w:val="0"/>
           <w:color w:val="000000"/>
-          <w:sz w:val="21"/>
+          <w:sz w:val="22"/>
         </w:rPr>
         <w:t>Friday</w:t>
       </w:r>
@@ -40,7 +40,7 @@
     <w:p>
       <w:pPr>
         <w:keepNext/>
-        <w:spacing w:before="120" w:after="60" w:line="240" w:lineRule="auto"/>
+        <w:spacing w:before="200" w:after="100" w:line="240" w:lineRule="auto"/>
         <w:jc w:val="left"/>
       </w:pPr>
       <w:r>
@@ -49,14 +49,14 @@
           <w:b/>
           <w:i w:val="0"/>
           <w:color w:val="000000"/>
-          <w:sz w:val="25"/>
+          <w:sz w:val="26"/>
         </w:rPr>
-        <w:t>WHAT IS ETL?</w:t>
+        <w:t>MODELS ON WHICH ETL (EAT TRUCK LOVE) OPERATES</w:t>
       </w:r>
     </w:p>
     <w:p>
       <w:pPr>
-        <w:spacing w:before="0" w:after="120" w:line="254" w:lineRule="auto"/>
+        <w:spacing w:before="0" w:after="120" w:line="264" w:lineRule="auto"/>
         <w:jc w:val="both"/>
       </w:pPr>
       <w:r>
@@ -65,48 +65,18 @@
           <w:b w:val="0"/>
           <w:i w:val="0"/>
           <w:color w:val="000000"/>
-          <w:sz w:val="21"/>
-        </w:rPr>
-        <w:t>ETL (Eat Truck Love) is a curated outdoor food-destination brand and a subsidiary of Azimuth Business on Wheels, India’s leading mobile infrastructure company. Azimuth designs and manufactures food kiosks, trucks and trailers; through ETL, we bring these units together into dedicated, ready-to-operate food zones. This gives new and established brands a legitimate, fully-serviced location to operate from — without the cost and rigidity of permanent construction. ETL currently operates live zones at Alpha 1, Central 50 and Bennett University.</w:t>
-      </w:r>
-    </w:p>
-    <w:p>
-      <w:pPr>
-        <w:keepNext/>
-        <w:spacing w:before="120" w:after="60" w:line="240" w:lineRule="auto"/>
-        <w:jc w:val="left"/>
-      </w:pPr>
-      <w:r>
-        <w:rPr>
-          <w:rFonts w:ascii="Arial" w:hAnsi="Arial" w:cs="Arial" w:eastAsia="Arial"/>
-          <w:b/>
-          <w:i w:val="0"/>
-          <w:color w:val="000000"/>
-          <w:sz w:val="25"/>
-        </w:rPr>
-        <w:t>MODELS ON WHICH ETL OPERATES</w:t>
-      </w:r>
-    </w:p>
-    <w:p>
-      <w:pPr>
-        <w:spacing w:before="0" w:after="80" w:line="254" w:lineRule="auto"/>
-        <w:jc w:val="both"/>
-      </w:pPr>
-      <w:r>
-        <w:rPr>
-          <w:rFonts w:ascii="Arial" w:hAnsi="Arial" w:cs="Arial" w:eastAsia="Arial"/>
-          <w:b w:val="0"/>
-          <w:i w:val="0"/>
-          <w:color w:val="000000"/>
-          <w:sz w:val="21"/>
+          <w:sz w:val="22"/>
         </w:rPr>
         <w:t>ETL operates on a real estate model, converting underutilised space into curated food zones. The arrangement with the property owner follows one of the following three models:</w:t>
       </w:r>
     </w:p>
     <w:p>
       <w:pPr>
-        <w:spacing w:before="0" w:after="80" w:line="254" w:lineRule="auto"/>
-        <w:ind w:left="280"/>
+        <w:tabs>
+          <w:tab w:pos="520" w:val="left"/>
+        </w:tabs>
+        <w:spacing w:before="0" w:after="120" w:line="264" w:lineRule="auto"/>
+        <w:ind w:left="520" w:hanging="520"/>
         <w:jc w:val="both"/>
       </w:pPr>
       <w:r>
@@ -115,7 +85,27 @@
           <w:b/>
           <w:i w:val="0"/>
           <w:color w:val="000000"/>
-          <w:sz w:val="21"/>
+          <w:sz w:val="22"/>
+        </w:rPr>
+        <w:t>1.</w:t>
+      </w:r>
+      <w:r>
+        <w:rPr>
+          <w:rFonts w:ascii="Arial" w:hAnsi="Arial" w:cs="Arial" w:eastAsia="Arial"/>
+          <w:b/>
+          <w:i w:val="0"/>
+          <w:color w:val="000000"/>
+          <w:sz w:val="22"/>
+        </w:rPr>
+        <w:tab/>
+      </w:r>
+      <w:r>
+        <w:rPr>
+          <w:rFonts w:ascii="Arial" w:hAnsi="Arial" w:cs="Arial" w:eastAsia="Arial"/>
+          <w:b/>
+          <w:i w:val="0"/>
+          <w:color w:val="000000"/>
+          <w:sz w:val="22"/>
         </w:rPr>
         <w:t xml:space="preserve">Pure Rentals — </w:t>
       </w:r>
@@ -125,15 +115,18 @@
           <w:b w:val="0"/>
           <w:i w:val="0"/>
           <w:color w:val="000000"/>
-          <w:sz w:val="21"/>
+          <w:sz w:val="22"/>
         </w:rPr>
         <w:t>ETL pays the property owner a fixed, pre-agreed rental for the space, set mutually on the basis of location, footfall potential, area and duration. It provides the owner with guaranteed, predictable income, while ETL retains the full revenue upside.</w:t>
       </w:r>
     </w:p>
     <w:p>
       <w:pPr>
-        <w:spacing w:before="0" w:after="80" w:line="254" w:lineRule="auto"/>
-        <w:ind w:left="280"/>
+        <w:tabs>
+          <w:tab w:pos="520" w:val="left"/>
+        </w:tabs>
+        <w:spacing w:before="0" w:after="120" w:line="264" w:lineRule="auto"/>
+        <w:ind w:left="520" w:hanging="520"/>
         <w:jc w:val="both"/>
       </w:pPr>
       <w:r>
@@ -142,7 +135,27 @@
           <w:b/>
           <w:i w:val="0"/>
           <w:color w:val="000000"/>
-          <w:sz w:val="21"/>
+          <w:sz w:val="22"/>
+        </w:rPr>
+        <w:t>2.</w:t>
+      </w:r>
+      <w:r>
+        <w:rPr>
+          <w:rFonts w:ascii="Arial" w:hAnsi="Arial" w:cs="Arial" w:eastAsia="Arial"/>
+          <w:b/>
+          <w:i w:val="0"/>
+          <w:color w:val="000000"/>
+          <w:sz w:val="22"/>
+        </w:rPr>
+        <w:tab/>
+      </w:r>
+      <w:r>
+        <w:rPr>
+          <w:rFonts w:ascii="Arial" w:hAnsi="Arial" w:cs="Arial" w:eastAsia="Arial"/>
+          <w:b/>
+          <w:i w:val="0"/>
+          <w:color w:val="000000"/>
+          <w:sz w:val="22"/>
         </w:rPr>
         <w:t xml:space="preserve">Pure Revenue Share — </w:t>
       </w:r>
@@ -152,15 +165,18 @@
           <w:b w:val="0"/>
           <w:i w:val="0"/>
           <w:color w:val="000000"/>
-          <w:sz w:val="21"/>
+          <w:sz w:val="22"/>
         </w:rPr>
         <w:t>There is no fixed rent; instead, a mutually agreed percentage of the zone’s revenue is shared with the property owner. Earnings move in proportion to performance, aligning both parties to drive footfall and sales — well suited to locations where footfall is still building.</w:t>
       </w:r>
     </w:p>
     <w:p>
       <w:pPr>
-        <w:spacing w:before="0" w:after="80" w:line="254" w:lineRule="auto"/>
-        <w:ind w:left="280"/>
+        <w:tabs>
+          <w:tab w:pos="520" w:val="left"/>
+        </w:tabs>
+        <w:spacing w:before="0" w:after="120" w:line="264" w:lineRule="auto"/>
+        <w:ind w:left="520" w:hanging="520"/>
         <w:jc w:val="both"/>
       </w:pPr>
       <w:r>
@@ -169,7 +185,27 @@
           <w:b/>
           <w:i w:val="0"/>
           <w:color w:val="000000"/>
-          <w:sz w:val="21"/>
+          <w:sz w:val="22"/>
+        </w:rPr>
+        <w:t>3.</w:t>
+      </w:r>
+      <w:r>
+        <w:rPr>
+          <w:rFonts w:ascii="Arial" w:hAnsi="Arial" w:cs="Arial" w:eastAsia="Arial"/>
+          <w:b/>
+          <w:i w:val="0"/>
+          <w:color w:val="000000"/>
+          <w:sz w:val="22"/>
+        </w:rPr>
+        <w:tab/>
+      </w:r>
+      <w:r>
+        <w:rPr>
+          <w:rFonts w:ascii="Arial" w:hAnsi="Arial" w:cs="Arial" w:eastAsia="Arial"/>
+          <w:b/>
+          <w:i w:val="0"/>
+          <w:color w:val="000000"/>
+          <w:sz w:val="22"/>
         </w:rPr>
         <w:t xml:space="preserve">Minimum Guarantee (MG) + Revenue Share — </w:t>
       </w:r>
@@ -179,7 +215,7 @@
           <w:b w:val="0"/>
           <w:i w:val="0"/>
           <w:color w:val="000000"/>
-          <w:sz w:val="21"/>
+          <w:sz w:val="22"/>
         </w:rPr>
         <w:t>A hybrid model combining an assured minimum guarantee — e.g., ₹1,00,000 per month payable regardless of performance — with a revenue share on sales above that threshold. On monthly sales of ₹1,50,000, the agreed share applies to the incremental ₹50,000, protecting the owner’s downside while sharing the upside.</w:t>
       </w:r>
@@ -187,7 +223,7 @@
     <w:p>
       <w:pPr>
         <w:keepNext/>
-        <w:spacing w:before="120" w:after="60" w:line="240" w:lineRule="auto"/>
+        <w:spacing w:before="200" w:after="100" w:line="240" w:lineRule="auto"/>
         <w:jc w:val="left"/>
       </w:pPr>
       <w:r>
@@ -196,14 +232,14 @@
           <w:b/>
           <w:i w:val="0"/>
           <w:color w:val="000000"/>
-          <w:sz w:val="25"/>
+          <w:sz w:val="26"/>
         </w:rPr>
-        <w:t>VARIABLE FACTORS RELATED TO ETL ZONE SETUP</w:t>
+        <w:t>VARIABLE FACTORS RELATED TO ETL (EAT TRUCK LOVE) ZONE SETUP</w:t>
       </w:r>
     </w:p>
     <w:p>
       <w:pPr>
-        <w:spacing w:before="0" w:after="80" w:line="254" w:lineRule="auto"/>
+        <w:spacing w:before="0" w:after="120" w:line="264" w:lineRule="auto"/>
         <w:jc w:val="both"/>
       </w:pPr>
       <w:r>
@@ -212,15 +248,18 @@
           <w:b w:val="0"/>
           <w:i w:val="0"/>
           <w:color w:val="000000"/>
-          <w:sz w:val="21"/>
+          <w:sz w:val="22"/>
         </w:rPr>
         <w:t>These factors vary by location and influence the model selected and the commercial terms:</w:t>
       </w:r>
     </w:p>
     <w:p>
       <w:pPr>
-        <w:spacing w:before="0" w:after="80" w:line="254" w:lineRule="auto"/>
-        <w:ind w:left="280"/>
+        <w:tabs>
+          <w:tab w:pos="520" w:val="left"/>
+        </w:tabs>
+        <w:spacing w:before="0" w:after="120" w:line="264" w:lineRule="auto"/>
+        <w:ind w:left="520" w:hanging="520"/>
         <w:jc w:val="both"/>
       </w:pPr>
       <w:r>
@@ -229,7 +268,27 @@
           <w:b/>
           <w:i w:val="0"/>
           <w:color w:val="000000"/>
-          <w:sz w:val="21"/>
+          <w:sz w:val="22"/>
+        </w:rPr>
+        <w:t>1.</w:t>
+      </w:r>
+      <w:r>
+        <w:rPr>
+          <w:rFonts w:ascii="Arial" w:hAnsi="Arial" w:cs="Arial" w:eastAsia="Arial"/>
+          <w:b/>
+          <w:i w:val="0"/>
+          <w:color w:val="000000"/>
+          <w:sz w:val="22"/>
+        </w:rPr>
+        <w:tab/>
+      </w:r>
+      <w:r>
+        <w:rPr>
+          <w:rFonts w:ascii="Arial" w:hAnsi="Arial" w:cs="Arial" w:eastAsia="Arial"/>
+          <w:b/>
+          <w:i w:val="0"/>
+          <w:color w:val="000000"/>
+          <w:sz w:val="22"/>
         </w:rPr>
         <w:t xml:space="preserve">Scope of Work — </w:t>
       </w:r>
@@ -239,15 +298,18 @@
           <w:b w:val="0"/>
           <w:i w:val="0"/>
           <w:color w:val="000000"/>
-          <w:sz w:val="21"/>
+          <w:sz w:val="22"/>
         </w:rPr>
         <w:t>The size and layout of the zone, the number of units and outlets, seating and common areas, and the infrastructure ETL provides versus the property owner.</w:t>
       </w:r>
     </w:p>
     <w:p>
       <w:pPr>
-        <w:spacing w:before="0" w:after="80" w:line="254" w:lineRule="auto"/>
-        <w:ind w:left="280"/>
+        <w:tabs>
+          <w:tab w:pos="520" w:val="left"/>
+        </w:tabs>
+        <w:spacing w:before="0" w:after="120" w:line="264" w:lineRule="auto"/>
+        <w:ind w:left="520" w:hanging="520"/>
         <w:jc w:val="both"/>
       </w:pPr>
       <w:r>
@@ -256,7 +318,27 @@
           <w:b/>
           <w:i w:val="0"/>
           <w:color w:val="000000"/>
-          <w:sz w:val="21"/>
+          <w:sz w:val="22"/>
+        </w:rPr>
+        <w:t>2.</w:t>
+      </w:r>
+      <w:r>
+        <w:rPr>
+          <w:rFonts w:ascii="Arial" w:hAnsi="Arial" w:cs="Arial" w:eastAsia="Arial"/>
+          <w:b/>
+          <w:i w:val="0"/>
+          <w:color w:val="000000"/>
+          <w:sz w:val="22"/>
+        </w:rPr>
+        <w:tab/>
+      </w:r>
+      <w:r>
+        <w:rPr>
+          <w:rFonts w:ascii="Arial" w:hAnsi="Arial" w:cs="Arial" w:eastAsia="Arial"/>
+          <w:b/>
+          <w:i w:val="0"/>
+          <w:color w:val="000000"/>
+          <w:sz w:val="22"/>
         </w:rPr>
         <w:t xml:space="preserve">Capital Influx — </w:t>
       </w:r>
@@ -266,15 +348,18 @@
           <w:b w:val="0"/>
           <w:i w:val="0"/>
           <w:color w:val="000000"/>
-          <w:sz w:val="21"/>
+          <w:sz w:val="22"/>
         </w:rPr>
         <w:t>The capital required to set up and operationalise the zone — site and civil work, utilities, unit fabrication and branding — and how it is funded between the parties.</w:t>
       </w:r>
     </w:p>
     <w:p>
       <w:pPr>
-        <w:spacing w:before="0" w:after="80" w:line="254" w:lineRule="auto"/>
-        <w:ind w:left="280"/>
+        <w:tabs>
+          <w:tab w:pos="520" w:val="left"/>
+        </w:tabs>
+        <w:spacing w:before="0" w:after="120" w:line="264" w:lineRule="auto"/>
+        <w:ind w:left="520" w:hanging="520"/>
         <w:jc w:val="both"/>
       </w:pPr>
       <w:r>
@@ -283,7 +368,27 @@
           <w:b/>
           <w:i w:val="0"/>
           <w:color w:val="000000"/>
-          <w:sz w:val="21"/>
+          <w:sz w:val="22"/>
+        </w:rPr>
+        <w:t>3.</w:t>
+      </w:r>
+      <w:r>
+        <w:rPr>
+          <w:rFonts w:ascii="Arial" w:hAnsi="Arial" w:cs="Arial" w:eastAsia="Arial"/>
+          <w:b/>
+          <w:i w:val="0"/>
+          <w:color w:val="000000"/>
+          <w:sz w:val="22"/>
+        </w:rPr>
+        <w:tab/>
+      </w:r>
+      <w:r>
+        <w:rPr>
+          <w:rFonts w:ascii="Arial" w:hAnsi="Arial" w:cs="Arial" w:eastAsia="Arial"/>
+          <w:b/>
+          <w:i w:val="0"/>
+          <w:color w:val="000000"/>
+          <w:sz w:val="22"/>
         </w:rPr>
         <w:t xml:space="preserve">Brands – Integration — </w:t>
       </w:r>
@@ -293,7 +398,7 @@
           <w:b w:val="0"/>
           <w:i w:val="0"/>
           <w:color w:val="000000"/>
-          <w:sz w:val="21"/>
+          <w:sz w:val="22"/>
         </w:rPr>
         <w:t>Curating the right mix of food &amp; beverage brands for the location’s audience and onboarding them onto the appropriate ETL units to create a compelling food destination.</w:t>
       </w:r>
@@ -436,7 +541,7 @@
             <a:graphicData uri="http://schemas.openxmlformats.org/drawingml/2006/picture">
               <pic:pic>
                 <pic:nvPicPr>
-                  <pic:cNvPr id="0" name="image3.png"/>
+                  <pic:cNvPr id="0" name="image1.png"/>
                   <pic:cNvPicPr/>
                 </pic:nvPicPr>
                 <pic:blipFill>
@@ -828,7 +933,7 @@
     <w:rPr>
       <w:rFonts w:ascii="Arial" w:hAnsi="Arial" w:cs="Arial" w:eastAsia="Arial"/>
       <w:color w:val="000000"/>
-      <w:sz w:val="21"/>
+      <w:sz w:val="22"/>
     </w:rPr>
   </w:style>
   <w:style w:type="paragraph" w:styleId="Header">

</xml_diff>